<commit_message>
Adding Gemini API option.
</commit_message>
<xml_diff>
--- a/Screenshots.docx
+++ b/Screenshots.docx
@@ -11,6 +11,7 @@
       <w:r>
         <w:rPr>
           <w:rFonts w:cs="Arial"/>
+          <w:noProof/>
           <w:rtl/>
         </w:rPr>
         <w:drawing>
@@ -56,23 +57,16 @@
           <w:rtl/>
         </w:rPr>
       </w:pPr>
-    </w:p>
-    <w:p>
-      <w:pPr>
-        <w:rPr>
-          <w:rtl/>
-        </w:rPr>
-      </w:pPr>
       <w:r>
         <w:rPr>
           <w:rFonts w:cs="Arial"/>
           <w:rtl/>
         </w:rPr>
         <w:drawing>
-          <wp:inline distT="0" distB="0" distL="0" distR="0" wp14:anchorId="2AF551A0" wp14:editId="60286759">
-            <wp:extent cx="5274310" cy="2715895"/>
-            <wp:effectExtent l="0" t="0" r="2540" b="8255"/>
-            <wp:docPr id="1732062605" name="תמונה 1"/>
+          <wp:inline distT="0" distB="0" distL="0" distR="0" wp14:anchorId="5A4615B1" wp14:editId="5FC99A2A">
+            <wp:extent cx="5274310" cy="2012950"/>
+            <wp:effectExtent l="0" t="0" r="2540" b="6350"/>
+            <wp:docPr id="2115031717" name="תמונה 1"/>
             <wp:cNvGraphicFramePr>
               <a:graphicFrameLocks xmlns:a="http://schemas.openxmlformats.org/drawingml/2006/main" noChangeAspect="1"/>
             </wp:cNvGraphicFramePr>
@@ -80,7 +74,7 @@
               <a:graphicData uri="http://schemas.openxmlformats.org/drawingml/2006/picture">
                 <pic:pic xmlns:pic="http://schemas.openxmlformats.org/drawingml/2006/picture">
                   <pic:nvPicPr>
-                    <pic:cNvPr id="1732062605" name=""/>
+                    <pic:cNvPr id="2115031717" name=""/>
                     <pic:cNvPicPr/>
                   </pic:nvPicPr>
                   <pic:blipFill>
@@ -92,7 +86,7 @@
                   <pic:spPr>
                     <a:xfrm>
                       <a:off x="0" y="0"/>
-                      <a:ext cx="5274310" cy="2715895"/>
+                      <a:ext cx="5274310" cy="2012950"/>
                     </a:xfrm>
                     <a:prstGeom prst="rect">
                       <a:avLst/>
@@ -111,9 +105,17 @@
           <w:rtl/>
         </w:rPr>
       </w:pPr>
+    </w:p>
+    <w:p>
+      <w:pPr>
+        <w:rPr>
+          <w:rtl/>
+        </w:rPr>
+      </w:pPr>
       <w:r>
         <w:rPr>
           <w:rFonts w:cs="Arial"/>
+          <w:noProof/>
           <w:rtl/>
         </w:rPr>
         <w:lastRenderedPageBreak/>
@@ -167,16 +169,23 @@
           <w:rtl/>
         </w:rPr>
       </w:pPr>
+    </w:p>
+    <w:p>
+      <w:pPr>
+        <w:rPr>
+          <w:rtl/>
+        </w:rPr>
+      </w:pPr>
       <w:r>
         <w:rPr>
           <w:rFonts w:cs="Arial"/>
           <w:rtl/>
         </w:rPr>
         <w:drawing>
-          <wp:inline distT="0" distB="0" distL="0" distR="0" wp14:anchorId="0316C257" wp14:editId="2CF74876">
-            <wp:extent cx="5274310" cy="2502535"/>
-            <wp:effectExtent l="0" t="0" r="2540" b="0"/>
-            <wp:docPr id="1928241157" name="תמונה 1"/>
+          <wp:inline distT="0" distB="0" distL="0" distR="0" wp14:anchorId="7EAE54C8" wp14:editId="77FE2A8B">
+            <wp:extent cx="5274310" cy="2662555"/>
+            <wp:effectExtent l="0" t="0" r="2540" b="4445"/>
+            <wp:docPr id="642273211" name="תמונה 1"/>
             <wp:cNvGraphicFramePr>
               <a:graphicFrameLocks xmlns:a="http://schemas.openxmlformats.org/drawingml/2006/main" noChangeAspect="1"/>
             </wp:cNvGraphicFramePr>
@@ -184,7 +193,7 @@
               <a:graphicData uri="http://schemas.openxmlformats.org/drawingml/2006/picture">
                 <pic:pic xmlns:pic="http://schemas.openxmlformats.org/drawingml/2006/picture">
                   <pic:nvPicPr>
-                    <pic:cNvPr id="1928241157" name=""/>
+                    <pic:cNvPr id="642273211" name=""/>
                     <pic:cNvPicPr/>
                   </pic:nvPicPr>
                   <pic:blipFill>
@@ -196,7 +205,7 @@
                   <pic:spPr>
                     <a:xfrm>
                       <a:off x="0" y="0"/>
-                      <a:ext cx="5274310" cy="2502535"/>
+                      <a:ext cx="5274310" cy="2662555"/>
                     </a:xfrm>
                     <a:prstGeom prst="rect">
                       <a:avLst/>
@@ -222,388 +231,85 @@
           <w:rtl/>
         </w:rPr>
       </w:pPr>
-      <w:r>
-        <w:rPr>
-          <w:rFonts w:cs="Arial"/>
-          <w:rtl/>
-        </w:rPr>
-        <w:drawing>
-          <wp:inline distT="0" distB="0" distL="0" distR="0" wp14:anchorId="4C0F5BB9" wp14:editId="7CB4C802">
-            <wp:extent cx="5274310" cy="2475865"/>
-            <wp:effectExtent l="0" t="0" r="2540" b="635"/>
-            <wp:docPr id="1569199744" name="תמונה 1"/>
-            <wp:cNvGraphicFramePr>
-              <a:graphicFrameLocks xmlns:a="http://schemas.openxmlformats.org/drawingml/2006/main" noChangeAspect="1"/>
-            </wp:cNvGraphicFramePr>
-            <a:graphic xmlns:a="http://schemas.openxmlformats.org/drawingml/2006/main">
-              <a:graphicData uri="http://schemas.openxmlformats.org/drawingml/2006/picture">
-                <pic:pic xmlns:pic="http://schemas.openxmlformats.org/drawingml/2006/picture">
-                  <pic:nvPicPr>
-                    <pic:cNvPr id="1569199744" name=""/>
-                    <pic:cNvPicPr/>
-                  </pic:nvPicPr>
-                  <pic:blipFill>
-                    <a:blip r:embed="rId8"/>
-                    <a:stretch>
-                      <a:fillRect/>
-                    </a:stretch>
-                  </pic:blipFill>
-                  <pic:spPr>
-                    <a:xfrm>
-                      <a:off x="0" y="0"/>
-                      <a:ext cx="5274310" cy="2475865"/>
-                    </a:xfrm>
-                    <a:prstGeom prst="rect">
-                      <a:avLst/>
-                    </a:prstGeom>
-                  </pic:spPr>
-                </pic:pic>
-              </a:graphicData>
-            </a:graphic>
-          </wp:inline>
-        </w:drawing>
-      </w:r>
-    </w:p>
-    <w:p>
-      <w:pPr>
-        <w:rPr>
-          <w:rtl/>
-        </w:rPr>
-      </w:pPr>
-    </w:p>
-    <w:p>
-      <w:pPr>
-        <w:rPr>
-          <w:rtl/>
-        </w:rPr>
-      </w:pPr>
-      <w:r>
-        <w:rPr>
-          <w:rFonts w:cs="Arial"/>
-          <w:rtl/>
-        </w:rPr>
-        <w:lastRenderedPageBreak/>
-        <w:drawing>
-          <wp:inline distT="0" distB="0" distL="0" distR="0" wp14:anchorId="468B8E6C" wp14:editId="7B98E846">
-            <wp:extent cx="5274310" cy="2964815"/>
-            <wp:effectExtent l="0" t="0" r="2540" b="6985"/>
-            <wp:docPr id="1447516815" name="תמונה 1"/>
-            <wp:cNvGraphicFramePr>
-              <a:graphicFrameLocks xmlns:a="http://schemas.openxmlformats.org/drawingml/2006/main" noChangeAspect="1"/>
-            </wp:cNvGraphicFramePr>
-            <a:graphic xmlns:a="http://schemas.openxmlformats.org/drawingml/2006/main">
-              <a:graphicData uri="http://schemas.openxmlformats.org/drawingml/2006/picture">
-                <pic:pic xmlns:pic="http://schemas.openxmlformats.org/drawingml/2006/picture">
-                  <pic:nvPicPr>
-                    <pic:cNvPr id="1447516815" name=""/>
-                    <pic:cNvPicPr/>
-                  </pic:nvPicPr>
-                  <pic:blipFill>
-                    <a:blip r:embed="rId9"/>
-                    <a:stretch>
-                      <a:fillRect/>
-                    </a:stretch>
-                  </pic:blipFill>
-                  <pic:spPr>
-                    <a:xfrm>
-                      <a:off x="0" y="0"/>
-                      <a:ext cx="5274310" cy="2964815"/>
-                    </a:xfrm>
-                    <a:prstGeom prst="rect">
-                      <a:avLst/>
-                    </a:prstGeom>
-                  </pic:spPr>
-                </pic:pic>
-              </a:graphicData>
-            </a:graphic>
-          </wp:inline>
-        </w:drawing>
-      </w:r>
-    </w:p>
-    <w:p>
-      <w:pPr>
-        <w:rPr>
-          <w:rtl/>
-        </w:rPr>
-      </w:pPr>
-    </w:p>
-    <w:p>
-      <w:pPr>
-        <w:rPr>
-          <w:rtl/>
-        </w:rPr>
-      </w:pPr>
-      <w:r>
-        <w:rPr>
-          <w:rFonts w:cs="Arial"/>
-          <w:rtl/>
-        </w:rPr>
-        <w:drawing>
-          <wp:inline distT="0" distB="0" distL="0" distR="0" wp14:anchorId="10C6980F" wp14:editId="583D4FBB">
-            <wp:extent cx="5274310" cy="2491105"/>
-            <wp:effectExtent l="0" t="0" r="2540" b="4445"/>
-            <wp:docPr id="2117951811" name="תמונה 1"/>
-            <wp:cNvGraphicFramePr>
-              <a:graphicFrameLocks xmlns:a="http://schemas.openxmlformats.org/drawingml/2006/main" noChangeAspect="1"/>
-            </wp:cNvGraphicFramePr>
-            <a:graphic xmlns:a="http://schemas.openxmlformats.org/drawingml/2006/main">
-              <a:graphicData uri="http://schemas.openxmlformats.org/drawingml/2006/picture">
-                <pic:pic xmlns:pic="http://schemas.openxmlformats.org/drawingml/2006/picture">
-                  <pic:nvPicPr>
-                    <pic:cNvPr id="2117951811" name=""/>
-                    <pic:cNvPicPr/>
-                  </pic:nvPicPr>
-                  <pic:blipFill>
-                    <a:blip r:embed="rId10"/>
-                    <a:stretch>
-                      <a:fillRect/>
-                    </a:stretch>
-                  </pic:blipFill>
-                  <pic:spPr>
-                    <a:xfrm>
-                      <a:off x="0" y="0"/>
-                      <a:ext cx="5274310" cy="2491105"/>
-                    </a:xfrm>
-                    <a:prstGeom prst="rect">
-                      <a:avLst/>
-                    </a:prstGeom>
-                  </pic:spPr>
-                </pic:pic>
-              </a:graphicData>
-            </a:graphic>
-          </wp:inline>
-        </w:drawing>
-      </w:r>
-    </w:p>
-    <w:p>
-      <w:pPr>
-        <w:rPr>
-          <w:rtl/>
-        </w:rPr>
-      </w:pPr>
-    </w:p>
-    <w:p>
-      <w:pPr>
-        <w:rPr>
-          <w:rtl/>
-        </w:rPr>
-      </w:pPr>
-      <w:r>
-        <w:rPr>
-          <w:rFonts w:cs="Arial"/>
-          <w:rtl/>
-        </w:rPr>
-        <w:lastRenderedPageBreak/>
-        <w:drawing>
-          <wp:inline distT="0" distB="0" distL="0" distR="0" wp14:anchorId="33792FB0" wp14:editId="5AE9F140">
-            <wp:extent cx="5274310" cy="4127500"/>
-            <wp:effectExtent l="0" t="0" r="2540" b="6350"/>
-            <wp:docPr id="601642518" name="תמונה 1"/>
-            <wp:cNvGraphicFramePr>
-              <a:graphicFrameLocks xmlns:a="http://schemas.openxmlformats.org/drawingml/2006/main" noChangeAspect="1"/>
-            </wp:cNvGraphicFramePr>
-            <a:graphic xmlns:a="http://schemas.openxmlformats.org/drawingml/2006/main">
-              <a:graphicData uri="http://schemas.openxmlformats.org/drawingml/2006/picture">
-                <pic:pic xmlns:pic="http://schemas.openxmlformats.org/drawingml/2006/picture">
-                  <pic:nvPicPr>
-                    <pic:cNvPr id="601642518" name=""/>
-                    <pic:cNvPicPr/>
-                  </pic:nvPicPr>
-                  <pic:blipFill>
-                    <a:blip r:embed="rId11"/>
-                    <a:stretch>
-                      <a:fillRect/>
-                    </a:stretch>
-                  </pic:blipFill>
-                  <pic:spPr>
-                    <a:xfrm>
-                      <a:off x="0" y="0"/>
-                      <a:ext cx="5274310" cy="4127500"/>
-                    </a:xfrm>
-                    <a:prstGeom prst="rect">
-                      <a:avLst/>
-                    </a:prstGeom>
-                  </pic:spPr>
-                </pic:pic>
-              </a:graphicData>
-            </a:graphic>
-          </wp:inline>
-        </w:drawing>
-      </w:r>
-    </w:p>
-    <w:p>
-      <w:pPr>
-        <w:rPr>
-          <w:rtl/>
-        </w:rPr>
-      </w:pPr>
-    </w:p>
-    <w:p>
-      <w:pPr>
-        <w:rPr>
-          <w:rtl/>
-        </w:rPr>
-      </w:pPr>
-      <w:r>
-        <w:rPr>
-          <w:rFonts w:cs="Arial"/>
-          <w:rtl/>
-        </w:rPr>
-        <w:drawing>
-          <wp:inline distT="0" distB="0" distL="0" distR="0" wp14:anchorId="37925AF4" wp14:editId="1EA09E84">
-            <wp:extent cx="5274310" cy="3404870"/>
-            <wp:effectExtent l="0" t="0" r="2540" b="5080"/>
-            <wp:docPr id="1853973276" name="תמונה 1"/>
-            <wp:cNvGraphicFramePr>
-              <a:graphicFrameLocks xmlns:a="http://schemas.openxmlformats.org/drawingml/2006/main" noChangeAspect="1"/>
-            </wp:cNvGraphicFramePr>
-            <a:graphic xmlns:a="http://schemas.openxmlformats.org/drawingml/2006/main">
-              <a:graphicData uri="http://schemas.openxmlformats.org/drawingml/2006/picture">
-                <pic:pic xmlns:pic="http://schemas.openxmlformats.org/drawingml/2006/picture">
-                  <pic:nvPicPr>
-                    <pic:cNvPr id="1853973276" name=""/>
-                    <pic:cNvPicPr/>
-                  </pic:nvPicPr>
-                  <pic:blipFill>
-                    <a:blip r:embed="rId12"/>
-                    <a:stretch>
-                      <a:fillRect/>
-                    </a:stretch>
-                  </pic:blipFill>
-                  <pic:spPr>
-                    <a:xfrm>
-                      <a:off x="0" y="0"/>
-                      <a:ext cx="5274310" cy="3404870"/>
-                    </a:xfrm>
-                    <a:prstGeom prst="rect">
-                      <a:avLst/>
-                    </a:prstGeom>
-                  </pic:spPr>
-                </pic:pic>
-              </a:graphicData>
-            </a:graphic>
-          </wp:inline>
-        </w:drawing>
-      </w:r>
-    </w:p>
-    <w:p>
-      <w:pPr>
-        <w:rPr>
-          <w:rtl/>
-        </w:rPr>
-      </w:pPr>
-    </w:p>
-    <w:p>
-      <w:pPr>
-        <w:rPr>
-          <w:rtl/>
-        </w:rPr>
-      </w:pPr>
-      <w:r>
-        <w:rPr>
-          <w:rFonts w:cs="Arial"/>
-          <w:rtl/>
-        </w:rPr>
-        <w:lastRenderedPageBreak/>
-        <w:drawing>
-          <wp:inline distT="0" distB="0" distL="0" distR="0" wp14:anchorId="556474EC" wp14:editId="421B581A">
-            <wp:extent cx="5274310" cy="5346700"/>
-            <wp:effectExtent l="0" t="0" r="2540" b="6350"/>
-            <wp:docPr id="452572255" name="תמונה 1"/>
-            <wp:cNvGraphicFramePr>
-              <a:graphicFrameLocks xmlns:a="http://schemas.openxmlformats.org/drawingml/2006/main" noChangeAspect="1"/>
-            </wp:cNvGraphicFramePr>
-            <a:graphic xmlns:a="http://schemas.openxmlformats.org/drawingml/2006/main">
-              <a:graphicData uri="http://schemas.openxmlformats.org/drawingml/2006/picture">
-                <pic:pic xmlns:pic="http://schemas.openxmlformats.org/drawingml/2006/picture">
-                  <pic:nvPicPr>
-                    <pic:cNvPr id="452572255" name=""/>
-                    <pic:cNvPicPr/>
-                  </pic:nvPicPr>
-                  <pic:blipFill>
-                    <a:blip r:embed="rId13"/>
-                    <a:stretch>
-                      <a:fillRect/>
-                    </a:stretch>
-                  </pic:blipFill>
-                  <pic:spPr>
-                    <a:xfrm>
-                      <a:off x="0" y="0"/>
-                      <a:ext cx="5274310" cy="5346700"/>
-                    </a:xfrm>
-                    <a:prstGeom prst="rect">
-                      <a:avLst/>
-                    </a:prstGeom>
-                  </pic:spPr>
-                </pic:pic>
-              </a:graphicData>
-            </a:graphic>
-          </wp:inline>
-        </w:drawing>
-      </w:r>
-    </w:p>
-    <w:p>
-      <w:pPr>
-        <w:rPr>
-          <w:rtl/>
-        </w:rPr>
-      </w:pPr>
-    </w:p>
-    <w:p>
-      <w:pPr>
-        <w:rPr>
-          <w:rtl/>
-        </w:rPr>
-      </w:pPr>
-      <w:r>
-        <w:rPr>
-          <w:rFonts w:cs="Arial"/>
-          <w:rtl/>
-        </w:rPr>
-        <w:drawing>
-          <wp:inline distT="0" distB="0" distL="0" distR="0" wp14:anchorId="48AEB602" wp14:editId="5C48FE0B">
-            <wp:extent cx="5274310" cy="2961640"/>
-            <wp:effectExtent l="0" t="0" r="2540" b="0"/>
-            <wp:docPr id="2110655586" name="תמונה 1"/>
-            <wp:cNvGraphicFramePr>
-              <a:graphicFrameLocks xmlns:a="http://schemas.openxmlformats.org/drawingml/2006/main" noChangeAspect="1"/>
-            </wp:cNvGraphicFramePr>
-            <a:graphic xmlns:a="http://schemas.openxmlformats.org/drawingml/2006/main">
-              <a:graphicData uri="http://schemas.openxmlformats.org/drawingml/2006/picture">
-                <pic:pic xmlns:pic="http://schemas.openxmlformats.org/drawingml/2006/picture">
-                  <pic:nvPicPr>
-                    <pic:cNvPr id="2110655586" name=""/>
-                    <pic:cNvPicPr/>
-                  </pic:nvPicPr>
-                  <pic:blipFill>
-                    <a:blip r:embed="rId14"/>
-                    <a:stretch>
-                      <a:fillRect/>
-                    </a:stretch>
-                  </pic:blipFill>
-                  <pic:spPr>
-                    <a:xfrm>
-                      <a:off x="0" y="0"/>
-                      <a:ext cx="5274310" cy="2961640"/>
-                    </a:xfrm>
-                    <a:prstGeom prst="rect">
-                      <a:avLst/>
-                    </a:prstGeom>
-                  </pic:spPr>
-                </pic:pic>
-              </a:graphicData>
-            </a:graphic>
-          </wp:inline>
-        </w:drawing>
-      </w:r>
-    </w:p>
-    <w:p>
-      <w:pPr>
-        <w:rPr>
-          <w:rFonts w:hint="cs"/>
-        </w:rPr>
-      </w:pPr>
-    </w:p>
+    </w:p>
+    <w:p>
+      <w:pPr>
+        <w:rPr>
+          <w:rtl/>
+        </w:rPr>
+      </w:pPr>
+    </w:p>
+    <w:p>
+      <w:pPr>
+        <w:rPr>
+          <w:rtl/>
+        </w:rPr>
+      </w:pPr>
+    </w:p>
+    <w:p>
+      <w:pPr>
+        <w:rPr>
+          <w:rtl/>
+        </w:rPr>
+      </w:pPr>
+    </w:p>
+    <w:p>
+      <w:pPr>
+        <w:rPr>
+          <w:rtl/>
+        </w:rPr>
+      </w:pPr>
+    </w:p>
+    <w:p>
+      <w:pPr>
+        <w:rPr>
+          <w:rtl/>
+        </w:rPr>
+      </w:pPr>
+    </w:p>
+    <w:p>
+      <w:pPr>
+        <w:rPr>
+          <w:rtl/>
+        </w:rPr>
+      </w:pPr>
+    </w:p>
+    <w:p>
+      <w:pPr>
+        <w:rPr>
+          <w:rtl/>
+        </w:rPr>
+      </w:pPr>
+    </w:p>
+    <w:p>
+      <w:pPr>
+        <w:rPr>
+          <w:rtl/>
+        </w:rPr>
+      </w:pPr>
+    </w:p>
+    <w:p>
+      <w:pPr>
+        <w:rPr>
+          <w:rtl/>
+        </w:rPr>
+      </w:pPr>
+    </w:p>
+    <w:p>
+      <w:pPr>
+        <w:rPr>
+          <w:rtl/>
+        </w:rPr>
+      </w:pPr>
+    </w:p>
+    <w:p>
+      <w:pPr>
+        <w:rPr>
+          <w:rtl/>
+        </w:rPr>
+      </w:pPr>
+    </w:p>
+    <w:p/>
     <w:sectPr>
       <w:pgSz w:w="11906" w:h="16838"/>
       <w:pgMar w:top="1440" w:right="1800" w:bottom="1440" w:left="1800" w:header="720" w:footer="720" w:gutter="0"/>

</xml_diff>